<commit_message>
Updates during meeting (12/06)
</commit_message>
<xml_diff>
--- a/Proof Reading and Review/TCB Mvt for Vn and Orch - Errata_v2.docx
+++ b/Proof Reading and Review/TCB Mvt for Vn and Orch - Errata_v2.docx
@@ -704,6 +704,24 @@
                 <w:szCs w:val="22"/>
               </w:rPr>
             </w:pPr>
+            <w:proofErr w:type="spellStart"/>
+            <w:r>
+              <w:rPr>
+                <w:rFonts w:ascii="Times New Roman" w:eastAsia="Times" w:hAnsi="Times New Roman" w:cs="Times New Roman"/>
+                <w:sz w:val="22"/>
+                <w:szCs w:val="22"/>
+              </w:rPr>
+              <w:t>Bsn</w:t>
+            </w:r>
+            <w:proofErr w:type="spellEnd"/>
+            <w:r>
+              <w:rPr>
+                <w:rFonts w:ascii="Times New Roman" w:eastAsia="Times" w:hAnsi="Times New Roman" w:cs="Times New Roman"/>
+                <w:sz w:val="22"/>
+                <w:szCs w:val="22"/>
+              </w:rPr>
+              <w:t xml:space="preserve"> </w:t>
+            </w:r>
           </w:p>
         </w:tc>
         <w:tc>
@@ -726,6 +744,14 @@
                 <w:szCs w:val="22"/>
               </w:rPr>
             </w:pPr>
+            <w:r>
+              <w:rPr>
+                <w:rFonts w:ascii="Times New Roman" w:eastAsia="Times" w:hAnsi="Times New Roman" w:cs="Times New Roman"/>
+                <w:sz w:val="22"/>
+                <w:szCs w:val="22"/>
+              </w:rPr>
+              <w:t>55-56</w:t>
+            </w:r>
           </w:p>
         </w:tc>
         <w:tc>
@@ -741,13 +767,45 @@
           </w:tcPr>
           <w:p>
             <w:pPr>
-              <w:spacing w:line="276" w:lineRule="auto"/>
-              <w:rPr>
-                <w:rFonts w:ascii="Times New Roman" w:eastAsia="Times" w:hAnsi="Times New Roman" w:cs="Times New Roman"/>
-                <w:sz w:val="22"/>
-                <w:szCs w:val="22"/>
-              </w:rPr>
-            </w:pPr>
+              <w:pStyle w:val="selectable-text"/>
+            </w:pPr>
+            <w:proofErr w:type="spellStart"/>
+            <w:r>
+              <w:rPr>
+                <w:rStyle w:val="selectable-text1"/>
+                <w:rFonts w:eastAsiaTheme="majorEastAsia"/>
+              </w:rPr>
+              <w:t>Bsns</w:t>
+            </w:r>
+            <w:proofErr w:type="spellEnd"/>
+            <w:r>
+              <w:rPr>
+                <w:rStyle w:val="selectable-text1"/>
+                <w:rFonts w:eastAsiaTheme="majorEastAsia"/>
+              </w:rPr>
+              <w:t xml:space="preserve"> - bar 55 - the diminuendo from bar 54 is unspecified. Would you like to specify an end dynamic?</w:t>
+            </w:r>
+          </w:p>
+          <w:p>
+            <w:pPr>
+              <w:pStyle w:val="selectable-text"/>
+            </w:pPr>
+            <w:proofErr w:type="spellStart"/>
+            <w:r>
+              <w:rPr>
+                <w:rStyle w:val="selectable-text1"/>
+                <w:rFonts w:eastAsiaTheme="majorEastAsia"/>
+              </w:rPr>
+              <w:t>Bsn</w:t>
+            </w:r>
+            <w:proofErr w:type="spellEnd"/>
+            <w:r>
+              <w:rPr>
+                <w:rStyle w:val="selectable-text1"/>
+                <w:rFonts w:eastAsiaTheme="majorEastAsia"/>
+              </w:rPr>
+              <w:t xml:space="preserve"> 1 bar 56 - there is no dynamic indicated here. Since we have the diminuendo in bar 54-55, even if that remains unspecified, we should specify the dynamic here. Let me know. </w:t>
+            </w:r>
           </w:p>
         </w:tc>
         <w:tc>
@@ -800,6 +858,15 @@
                 <w:szCs w:val="22"/>
               </w:rPr>
             </w:pPr>
+            <w:r>
+              <w:rPr>
+                <w:rFonts w:ascii="Times New Roman" w:eastAsia="Times" w:hAnsi="Times New Roman" w:cs="Times New Roman"/>
+                <w:color w:val="00B050"/>
+                <w:sz w:val="22"/>
+                <w:szCs w:val="22"/>
+              </w:rPr>
+              <w:t>All</w:t>
+            </w:r>
           </w:p>
         </w:tc>
         <w:tc>
@@ -823,6 +890,15 @@
                 <w:szCs w:val="22"/>
               </w:rPr>
             </w:pPr>
+            <w:r>
+              <w:rPr>
+                <w:rFonts w:ascii="Times New Roman" w:eastAsia="Times" w:hAnsi="Times New Roman" w:cs="Times New Roman"/>
+                <w:color w:val="00B050"/>
+                <w:sz w:val="22"/>
+                <w:szCs w:val="22"/>
+              </w:rPr>
+              <w:t>69</w:t>
+            </w:r>
           </w:p>
         </w:tc>
         <w:tc>
@@ -846,6 +922,422 @@
                 <w:szCs w:val="22"/>
               </w:rPr>
             </w:pPr>
+            <w:r>
+              <w:rPr>
+                <w:rFonts w:ascii="Times New Roman" w:eastAsia="Times" w:hAnsi="Times New Roman" w:cs="Times New Roman"/>
+                <w:color w:val="00B050"/>
+                <w:sz w:val="22"/>
+                <w:szCs w:val="22"/>
+              </w:rPr>
+              <w:t>Only some instruments have caesura at the end of this bar. Should we add to all instruments?</w:t>
+            </w:r>
+          </w:p>
+        </w:tc>
+        <w:tc>
+          <w:tcPr>
+            <w:tcW w:w="1024" w:type="pct"/>
+            <w:tcBorders>
+              <w:top w:val="single" w:sz="4" w:space="0" w:color="000000"/>
+              <w:left w:val="single" w:sz="4" w:space="0" w:color="000000"/>
+              <w:bottom w:val="single" w:sz="4" w:space="0" w:color="000000"/>
+              <w:right w:val="single" w:sz="4" w:space="0" w:color="000000"/>
+            </w:tcBorders>
+            <w:vAlign w:val="center"/>
+          </w:tcPr>
+          <w:p>
+            <w:pPr>
+              <w:spacing w:line="276" w:lineRule="auto"/>
+              <w:rPr>
+                <w:rFonts w:ascii="Times New Roman" w:eastAsia="Times" w:hAnsi="Times New Roman" w:cs="Times New Roman"/>
+                <w:color w:val="00B050"/>
+                <w:sz w:val="22"/>
+                <w:szCs w:val="22"/>
+              </w:rPr>
+            </w:pPr>
+          </w:p>
+        </w:tc>
+      </w:tr>
+      <w:tr>
+        <w:trPr>
+          <w:trHeight w:val="350"/>
+        </w:trPr>
+        <w:tc>
+          <w:tcPr>
+            <w:tcW w:w="756" w:type="pct"/>
+            <w:tcBorders>
+              <w:top w:val="single" w:sz="4" w:space="0" w:color="000000"/>
+              <w:left w:val="single" w:sz="4" w:space="0" w:color="000000"/>
+              <w:bottom w:val="single" w:sz="4" w:space="0" w:color="000000"/>
+              <w:right w:val="single" w:sz="4" w:space="0" w:color="000000"/>
+            </w:tcBorders>
+            <w:vAlign w:val="center"/>
+          </w:tcPr>
+          <w:p>
+            <w:pPr>
+              <w:spacing w:line="276" w:lineRule="auto"/>
+              <w:rPr>
+                <w:rFonts w:ascii="Times New Roman" w:eastAsia="Times" w:hAnsi="Times New Roman" w:cs="Times New Roman"/>
+                <w:color w:val="00B050"/>
+                <w:sz w:val="22"/>
+                <w:szCs w:val="22"/>
+              </w:rPr>
+            </w:pPr>
+            <w:proofErr w:type="spellStart"/>
+            <w:r>
+              <w:rPr>
+                <w:rFonts w:ascii="Times New Roman" w:eastAsia="Times" w:hAnsi="Times New Roman" w:cs="Times New Roman"/>
+                <w:color w:val="00B050"/>
+                <w:sz w:val="22"/>
+                <w:szCs w:val="22"/>
+              </w:rPr>
+              <w:t>Bsns</w:t>
+            </w:r>
+            <w:proofErr w:type="spellEnd"/>
+          </w:p>
+        </w:tc>
+        <w:tc>
+          <w:tcPr>
+            <w:tcW w:w="727" w:type="pct"/>
+            <w:tcBorders>
+              <w:top w:val="single" w:sz="4" w:space="0" w:color="000000"/>
+              <w:left w:val="single" w:sz="4" w:space="0" w:color="000000"/>
+              <w:bottom w:val="single" w:sz="4" w:space="0" w:color="000000"/>
+              <w:right w:val="single" w:sz="4" w:space="0" w:color="000000"/>
+            </w:tcBorders>
+            <w:vAlign w:val="center"/>
+          </w:tcPr>
+          <w:p>
+            <w:pPr>
+              <w:spacing w:line="276" w:lineRule="auto"/>
+              <w:rPr>
+                <w:rFonts w:ascii="Times New Roman" w:eastAsia="Times" w:hAnsi="Times New Roman" w:cs="Times New Roman"/>
+                <w:color w:val="00B050"/>
+                <w:sz w:val="22"/>
+                <w:szCs w:val="22"/>
+              </w:rPr>
+            </w:pPr>
+            <w:r>
+              <w:rPr>
+                <w:rFonts w:ascii="Times New Roman" w:eastAsia="Times" w:hAnsi="Times New Roman" w:cs="Times New Roman"/>
+                <w:color w:val="00B050"/>
+                <w:sz w:val="22"/>
+                <w:szCs w:val="22"/>
+              </w:rPr>
+              <w:t>91</w:t>
+            </w:r>
+          </w:p>
+        </w:tc>
+        <w:tc>
+          <w:tcPr>
+            <w:tcW w:w="2493" w:type="pct"/>
+            <w:tcBorders>
+              <w:top w:val="single" w:sz="4" w:space="0" w:color="000000"/>
+              <w:left w:val="single" w:sz="4" w:space="0" w:color="000000"/>
+              <w:bottom w:val="single" w:sz="4" w:space="0" w:color="000000"/>
+              <w:right w:val="single" w:sz="4" w:space="0" w:color="000000"/>
+            </w:tcBorders>
+            <w:vAlign w:val="center"/>
+          </w:tcPr>
+          <w:p>
+            <w:pPr>
+              <w:spacing w:line="276" w:lineRule="auto"/>
+              <w:rPr>
+                <w:rFonts w:ascii="Times New Roman" w:eastAsia="Times" w:hAnsi="Times New Roman" w:cs="Times New Roman"/>
+                <w:color w:val="00B050"/>
+                <w:sz w:val="22"/>
+                <w:szCs w:val="22"/>
+              </w:rPr>
+            </w:pPr>
+            <w:r>
+              <w:rPr>
+                <w:rFonts w:ascii="Times New Roman" w:eastAsia="Times" w:hAnsi="Times New Roman" w:cs="Times New Roman"/>
+                <w:color w:val="00B050"/>
+                <w:sz w:val="22"/>
+                <w:szCs w:val="22"/>
+              </w:rPr>
+              <w:t xml:space="preserve">Horns have </w:t>
+            </w:r>
+            <w:r>
+              <w:rPr>
+                <w:rFonts w:ascii="Times New Roman" w:eastAsia="Times" w:hAnsi="Times New Roman" w:cs="Times New Roman"/>
+                <w:b/>
+                <w:bCs/>
+                <w:i/>
+                <w:iCs/>
+                <w:color w:val="00B050"/>
+                <w:sz w:val="22"/>
+                <w:szCs w:val="22"/>
+              </w:rPr>
+              <w:t>mf dolce</w:t>
+            </w:r>
+            <w:r>
+              <w:rPr>
+                <w:rFonts w:ascii="Times New Roman" w:eastAsia="Times" w:hAnsi="Times New Roman" w:cs="Times New Roman"/>
+                <w:color w:val="00B050"/>
+                <w:sz w:val="22"/>
+                <w:szCs w:val="22"/>
+              </w:rPr>
+              <w:t xml:space="preserve"> shouldn't the bassoons also have?</w:t>
+            </w:r>
+          </w:p>
+        </w:tc>
+        <w:tc>
+          <w:tcPr>
+            <w:tcW w:w="1024" w:type="pct"/>
+            <w:tcBorders>
+              <w:top w:val="single" w:sz="4" w:space="0" w:color="000000"/>
+              <w:left w:val="single" w:sz="4" w:space="0" w:color="000000"/>
+              <w:bottom w:val="single" w:sz="4" w:space="0" w:color="000000"/>
+              <w:right w:val="single" w:sz="4" w:space="0" w:color="000000"/>
+            </w:tcBorders>
+            <w:vAlign w:val="center"/>
+          </w:tcPr>
+          <w:p>
+            <w:pPr>
+              <w:spacing w:line="276" w:lineRule="auto"/>
+              <w:rPr>
+                <w:rFonts w:ascii="Times New Roman" w:eastAsia="Times" w:hAnsi="Times New Roman" w:cs="Times New Roman"/>
+                <w:color w:val="00B050"/>
+                <w:sz w:val="22"/>
+                <w:szCs w:val="22"/>
+              </w:rPr>
+            </w:pPr>
+          </w:p>
+        </w:tc>
+      </w:tr>
+      <w:tr>
+        <w:trPr>
+          <w:trHeight w:val="350"/>
+        </w:trPr>
+        <w:tc>
+          <w:tcPr>
+            <w:tcW w:w="756" w:type="pct"/>
+            <w:tcBorders>
+              <w:top w:val="single" w:sz="4" w:space="0" w:color="000000"/>
+              <w:left w:val="single" w:sz="4" w:space="0" w:color="000000"/>
+              <w:bottom w:val="single" w:sz="4" w:space="0" w:color="000000"/>
+              <w:right w:val="single" w:sz="4" w:space="0" w:color="000000"/>
+            </w:tcBorders>
+            <w:vAlign w:val="center"/>
+          </w:tcPr>
+          <w:p>
+            <w:pPr>
+              <w:spacing w:line="276" w:lineRule="auto"/>
+              <w:rPr>
+                <w:rFonts w:ascii="Times New Roman" w:eastAsia="Times" w:hAnsi="Times New Roman" w:cs="Times New Roman"/>
+                <w:color w:val="00B050"/>
+                <w:sz w:val="22"/>
+                <w:szCs w:val="22"/>
+              </w:rPr>
+            </w:pPr>
+            <w:r>
+              <w:rPr>
+                <w:rFonts w:ascii="Times New Roman" w:eastAsia="Times" w:hAnsi="Times New Roman" w:cs="Times New Roman"/>
+                <w:color w:val="00B050"/>
+                <w:sz w:val="22"/>
+                <w:szCs w:val="22"/>
+              </w:rPr>
+              <w:t>Cl. 2</w:t>
+            </w:r>
+          </w:p>
+        </w:tc>
+        <w:tc>
+          <w:tcPr>
+            <w:tcW w:w="727" w:type="pct"/>
+            <w:tcBorders>
+              <w:top w:val="single" w:sz="4" w:space="0" w:color="000000"/>
+              <w:left w:val="single" w:sz="4" w:space="0" w:color="000000"/>
+              <w:bottom w:val="single" w:sz="4" w:space="0" w:color="000000"/>
+              <w:right w:val="single" w:sz="4" w:space="0" w:color="000000"/>
+            </w:tcBorders>
+            <w:vAlign w:val="center"/>
+          </w:tcPr>
+          <w:p>
+            <w:pPr>
+              <w:spacing w:line="276" w:lineRule="auto"/>
+              <w:rPr>
+                <w:rFonts w:ascii="Times New Roman" w:eastAsia="Times" w:hAnsi="Times New Roman" w:cs="Times New Roman"/>
+                <w:color w:val="00B050"/>
+                <w:sz w:val="22"/>
+                <w:szCs w:val="22"/>
+              </w:rPr>
+            </w:pPr>
+            <w:r>
+              <w:rPr>
+                <w:rFonts w:ascii="Times New Roman" w:eastAsia="Times" w:hAnsi="Times New Roman" w:cs="Times New Roman"/>
+                <w:color w:val="00B050"/>
+                <w:sz w:val="22"/>
+                <w:szCs w:val="22"/>
+              </w:rPr>
+              <w:t>99</w:t>
+            </w:r>
+          </w:p>
+        </w:tc>
+        <w:tc>
+          <w:tcPr>
+            <w:tcW w:w="2493" w:type="pct"/>
+            <w:tcBorders>
+              <w:top w:val="single" w:sz="4" w:space="0" w:color="000000"/>
+              <w:left w:val="single" w:sz="4" w:space="0" w:color="000000"/>
+              <w:bottom w:val="single" w:sz="4" w:space="0" w:color="000000"/>
+              <w:right w:val="single" w:sz="4" w:space="0" w:color="000000"/>
+            </w:tcBorders>
+            <w:vAlign w:val="center"/>
+          </w:tcPr>
+          <w:p>
+            <w:pPr>
+              <w:spacing w:line="276" w:lineRule="auto"/>
+              <w:rPr>
+                <w:rFonts w:ascii="Times New Roman" w:eastAsia="Times" w:hAnsi="Times New Roman" w:cs="Times New Roman"/>
+                <w:color w:val="00B050"/>
+                <w:sz w:val="22"/>
+                <w:szCs w:val="22"/>
+              </w:rPr>
+            </w:pPr>
+            <w:r>
+              <w:rPr>
+                <w:rFonts w:ascii="Times New Roman" w:eastAsia="Times" w:hAnsi="Times New Roman" w:cs="Times New Roman"/>
+                <w:color w:val="00B050"/>
+                <w:sz w:val="22"/>
+                <w:szCs w:val="22"/>
+              </w:rPr>
+              <w:t>Beat 3 has an accent but all other winds don't. Is this correct?</w:t>
+            </w:r>
+          </w:p>
+        </w:tc>
+        <w:tc>
+          <w:tcPr>
+            <w:tcW w:w="1024" w:type="pct"/>
+            <w:tcBorders>
+              <w:top w:val="single" w:sz="4" w:space="0" w:color="000000"/>
+              <w:left w:val="single" w:sz="4" w:space="0" w:color="000000"/>
+              <w:bottom w:val="single" w:sz="4" w:space="0" w:color="000000"/>
+              <w:right w:val="single" w:sz="4" w:space="0" w:color="000000"/>
+            </w:tcBorders>
+            <w:vAlign w:val="center"/>
+          </w:tcPr>
+          <w:p>
+            <w:pPr>
+              <w:spacing w:line="276" w:lineRule="auto"/>
+              <w:rPr>
+                <w:rFonts w:ascii="Times New Roman" w:eastAsia="Times" w:hAnsi="Times New Roman" w:cs="Times New Roman"/>
+                <w:color w:val="00B050"/>
+                <w:sz w:val="22"/>
+                <w:szCs w:val="22"/>
+              </w:rPr>
+            </w:pPr>
+          </w:p>
+        </w:tc>
+      </w:tr>
+      <w:tr>
+        <w:trPr>
+          <w:trHeight w:val="350"/>
+        </w:trPr>
+        <w:tc>
+          <w:tcPr>
+            <w:tcW w:w="756" w:type="pct"/>
+            <w:tcBorders>
+              <w:top w:val="single" w:sz="4" w:space="0" w:color="000000"/>
+              <w:left w:val="single" w:sz="4" w:space="0" w:color="000000"/>
+              <w:bottom w:val="single" w:sz="4" w:space="0" w:color="000000"/>
+              <w:right w:val="single" w:sz="4" w:space="0" w:color="000000"/>
+            </w:tcBorders>
+            <w:vAlign w:val="center"/>
+          </w:tcPr>
+          <w:p>
+            <w:pPr>
+              <w:spacing w:line="276" w:lineRule="auto"/>
+              <w:rPr>
+                <w:rFonts w:ascii="Times New Roman" w:eastAsia="Times" w:hAnsi="Times New Roman" w:cs="Times New Roman"/>
+                <w:color w:val="00B050"/>
+                <w:sz w:val="22"/>
+                <w:szCs w:val="22"/>
+              </w:rPr>
+            </w:pPr>
+            <w:proofErr w:type="spellStart"/>
+            <w:r>
+              <w:rPr>
+                <w:rFonts w:ascii="Times New Roman" w:eastAsia="Times" w:hAnsi="Times New Roman" w:cs="Times New Roman"/>
+                <w:color w:val="00B050"/>
+                <w:sz w:val="22"/>
+                <w:szCs w:val="22"/>
+              </w:rPr>
+              <w:t>Tbns</w:t>
+            </w:r>
+            <w:proofErr w:type="spellEnd"/>
+            <w:r>
+              <w:rPr>
+                <w:rFonts w:ascii="Times New Roman" w:eastAsia="Times" w:hAnsi="Times New Roman" w:cs="Times New Roman"/>
+                <w:color w:val="00B050"/>
+                <w:sz w:val="22"/>
+                <w:szCs w:val="22"/>
+              </w:rPr>
+              <w:t xml:space="preserve"> and Tba</w:t>
+            </w:r>
+          </w:p>
+        </w:tc>
+        <w:tc>
+          <w:tcPr>
+            <w:tcW w:w="727" w:type="pct"/>
+            <w:tcBorders>
+              <w:top w:val="single" w:sz="4" w:space="0" w:color="000000"/>
+              <w:left w:val="single" w:sz="4" w:space="0" w:color="000000"/>
+              <w:bottom w:val="single" w:sz="4" w:space="0" w:color="000000"/>
+              <w:right w:val="single" w:sz="4" w:space="0" w:color="000000"/>
+            </w:tcBorders>
+            <w:vAlign w:val="center"/>
+          </w:tcPr>
+          <w:p>
+            <w:pPr>
+              <w:spacing w:line="276" w:lineRule="auto"/>
+              <w:rPr>
+                <w:rFonts w:ascii="Times New Roman" w:eastAsia="Times" w:hAnsi="Times New Roman" w:cs="Times New Roman"/>
+                <w:color w:val="00B050"/>
+                <w:sz w:val="22"/>
+                <w:szCs w:val="22"/>
+              </w:rPr>
+            </w:pPr>
+            <w:r>
+              <w:rPr>
+                <w:rFonts w:ascii="Times New Roman" w:eastAsia="Times" w:hAnsi="Times New Roman" w:cs="Times New Roman"/>
+                <w:color w:val="00B050"/>
+                <w:sz w:val="22"/>
+                <w:szCs w:val="22"/>
+              </w:rPr>
+              <w:t>109</w:t>
+            </w:r>
+          </w:p>
+        </w:tc>
+        <w:tc>
+          <w:tcPr>
+            <w:tcW w:w="2493" w:type="pct"/>
+            <w:tcBorders>
+              <w:top w:val="single" w:sz="4" w:space="0" w:color="000000"/>
+              <w:left w:val="single" w:sz="4" w:space="0" w:color="000000"/>
+              <w:bottom w:val="single" w:sz="4" w:space="0" w:color="000000"/>
+              <w:right w:val="single" w:sz="4" w:space="0" w:color="000000"/>
+            </w:tcBorders>
+            <w:vAlign w:val="center"/>
+          </w:tcPr>
+          <w:p>
+            <w:pPr>
+              <w:spacing w:line="276" w:lineRule="auto"/>
+              <w:rPr>
+                <w:rFonts w:ascii="Times New Roman" w:eastAsia="Times" w:hAnsi="Times New Roman" w:cs="Times New Roman"/>
+                <w:color w:val="00B050"/>
+                <w:sz w:val="22"/>
+                <w:szCs w:val="22"/>
+              </w:rPr>
+            </w:pPr>
+            <w:r>
+              <w:rPr>
+                <w:rFonts w:ascii="Times New Roman" w:eastAsia="Times" w:hAnsi="Times New Roman" w:cs="Times New Roman"/>
+                <w:color w:val="00B050"/>
+                <w:sz w:val="22"/>
+                <w:szCs w:val="22"/>
+              </w:rPr>
+              <w:t>Is there a missing crescendo here?</w:t>
+            </w:r>
           </w:p>
         </w:tc>
         <w:tc>
@@ -2364,27 +2856,7 @@
                 <w:sz w:val="22"/>
                 <w:szCs w:val="22"/>
               </w:rPr>
-              <w:t xml:space="preserve">Do you want </w:t>
-            </w:r>
-            <w:proofErr w:type="gramStart"/>
-            <w:r>
-              <w:rPr>
-                <w:rFonts w:ascii="Times New Roman" w:eastAsia="Times" w:hAnsi="Times New Roman" w:cs="Times New Roman"/>
-                <w:color w:val="00B050"/>
-                <w:sz w:val="22"/>
-                <w:szCs w:val="22"/>
-              </w:rPr>
-              <w:t>non div</w:t>
-            </w:r>
-            <w:proofErr w:type="gramEnd"/>
-            <w:r>
-              <w:rPr>
-                <w:rFonts w:ascii="Times New Roman" w:eastAsia="Times" w:hAnsi="Times New Roman" w:cs="Times New Roman"/>
-                <w:color w:val="00B050"/>
-                <w:sz w:val="22"/>
-                <w:szCs w:val="22"/>
-              </w:rPr>
-              <w:t xml:space="preserve"> for the entire bar as we have written?</w:t>
+              <w:t>Do you want non div for the entire bar as we have written?</w:t>
             </w:r>
           </w:p>
         </w:tc>
@@ -2870,7 +3342,6 @@
               </w:rPr>
               <w:t xml:space="preserve">nderstand the </w:t>
             </w:r>
-            <w:proofErr w:type="gramStart"/>
             <w:r>
               <w:rPr>
                 <w:rFonts w:ascii="Times New Roman" w:eastAsia="Times" w:hAnsi="Times New Roman" w:cs="Times New Roman"/>
@@ -2887,17 +3358,7 @@
                 <w:sz w:val="22"/>
                 <w:szCs w:val="22"/>
               </w:rPr>
-              <w:t xml:space="preserve"> but</w:t>
-            </w:r>
-            <w:proofErr w:type="gramEnd"/>
-            <w:r>
-              <w:rPr>
-                <w:rFonts w:ascii="Times New Roman" w:eastAsia="Times" w:hAnsi="Times New Roman" w:cs="Times New Roman"/>
-                <w:color w:val="00B050"/>
-                <w:sz w:val="22"/>
-                <w:szCs w:val="22"/>
-              </w:rPr>
-              <w:t xml:space="preserve"> this </w:t>
+              <w:t xml:space="preserve"> but this </w:t>
             </w:r>
             <w:r>
               <w:rPr>
@@ -5383,27 +5844,7 @@
                 <w:sz w:val="22"/>
                 <w:szCs w:val="22"/>
               </w:rPr>
-              <w:t xml:space="preserve">Added treble clef change to reduce ledger lines in original alto clef. </w:t>
-            </w:r>
-            <w:proofErr w:type="gramStart"/>
-            <w:r>
-              <w:rPr>
-                <w:rFonts w:ascii="Times New Roman" w:eastAsia="Times" w:hAnsi="Times New Roman" w:cs="Times New Roman"/>
-                <w:color w:val="00B050"/>
-                <w:sz w:val="22"/>
-                <w:szCs w:val="22"/>
-              </w:rPr>
-              <w:t>Lasts</w:t>
-            </w:r>
-            <w:proofErr w:type="gramEnd"/>
-            <w:r>
-              <w:rPr>
-                <w:rFonts w:ascii="Times New Roman" w:eastAsia="Times" w:hAnsi="Times New Roman" w:cs="Times New Roman"/>
-                <w:color w:val="00B050"/>
-                <w:sz w:val="22"/>
-                <w:szCs w:val="22"/>
-              </w:rPr>
-              <w:t xml:space="preserve"> for 2 bars. </w:t>
+              <w:t xml:space="preserve">Added treble clef change to reduce ledger lines in original alto clef. Lasts for 2 bars. </w:t>
             </w:r>
           </w:p>
         </w:tc>
@@ -7756,21 +8197,7 @@
               <w:rPr>
                 <w:rFonts w:ascii="Times New Roman" w:eastAsia="Times" w:hAnsi="Times New Roman" w:cs="Times New Roman"/>
               </w:rPr>
-              <w:t xml:space="preserve">s are redundant given the tenuto symbols. However, if it is a preference or the intention is for a more pronounced tenuto, let me know. If </w:t>
-            </w:r>
-            <w:proofErr w:type="gramStart"/>
-            <w:r>
-              <w:rPr>
-                <w:rFonts w:ascii="Times New Roman" w:eastAsia="Times" w:hAnsi="Times New Roman" w:cs="Times New Roman"/>
-              </w:rPr>
-              <w:t>no</w:t>
-            </w:r>
-            <w:proofErr w:type="gramEnd"/>
-            <w:r>
-              <w:rPr>
-                <w:rFonts w:ascii="Times New Roman" w:eastAsia="Times" w:hAnsi="Times New Roman" w:cs="Times New Roman"/>
-              </w:rPr>
-              <w:t xml:space="preserve"> preference, we could potentially remove them, except at key moments, and just ensure a tenuto symbol is present. </w:t>
+              <w:t xml:space="preserve">s are redundant given the tenuto symbols. However, if it is a preference or the intention is for a more pronounced tenuto, let me know. If no preference, we could potentially remove them, except at key moments, and just ensure a tenuto symbol is present. </w:t>
             </w:r>
           </w:p>
         </w:tc>
@@ -7856,21 +8283,7 @@
               <w:rPr>
                 <w:rFonts w:ascii="Times New Roman" w:eastAsia="Times" w:hAnsi="Times New Roman" w:cs="Times New Roman"/>
               </w:rPr>
-              <w:t xml:space="preserve">Technically does the sul G continue from m. 19 till the F </w:t>
-            </w:r>
-            <w:proofErr w:type="gramStart"/>
-            <w:r>
-              <w:rPr>
-                <w:rFonts w:ascii="Times New Roman" w:eastAsia="Times" w:hAnsi="Times New Roman" w:cs="Times New Roman"/>
-              </w:rPr>
-              <w:t>in</w:t>
-            </w:r>
-            <w:proofErr w:type="gramEnd"/>
-            <w:r>
-              <w:rPr>
-                <w:rFonts w:ascii="Times New Roman" w:eastAsia="Times" w:hAnsi="Times New Roman" w:cs="Times New Roman"/>
-              </w:rPr>
-              <w:t xml:space="preserve"> m. 27? Will format accordingly</w:t>
+              <w:t>Technically does the sul G continue from m. 19 till the F in m. 27? Will format accordingly</w:t>
             </w:r>
           </w:p>
         </w:tc>
@@ -7998,21 +8411,7 @@
               <w:rPr>
                 <w:rFonts w:ascii="Times New Roman" w:eastAsia="Times" w:hAnsi="Times New Roman" w:cs="Times New Roman"/>
               </w:rPr>
-              <w:t xml:space="preserve">. Should it </w:t>
-            </w:r>
-            <w:proofErr w:type="gramStart"/>
-            <w:r>
-              <w:rPr>
-                <w:rFonts w:ascii="Times New Roman" w:eastAsia="Times" w:hAnsi="Times New Roman" w:cs="Times New Roman"/>
-              </w:rPr>
-              <w:t>dim.</w:t>
-            </w:r>
-            <w:proofErr w:type="gramEnd"/>
-            <w:r>
-              <w:rPr>
-                <w:rFonts w:ascii="Times New Roman" w:eastAsia="Times" w:hAnsi="Times New Roman" w:cs="Times New Roman"/>
-              </w:rPr>
-              <w:t xml:space="preserve"> to a different dynamic, with a sub. </w:t>
+              <w:t xml:space="preserve">. Should it dim. to a different dynamic, with a sub. </w:t>
             </w:r>
             <w:r>
               <w:rPr>
@@ -10584,6 +10983,24 @@
     <w:uiPriority w:val="99"/>
     <w:rsid w:val="00E3284F"/>
   </w:style>
+  <w:style w:type="paragraph" w:customStyle="1" w:styleId="selectable-text">
+    <w:name w:val="selectable-text"/>
+    <w:basedOn w:val="Normal"/>
+    <w:rsid w:val="00C8494C"/>
+    <w:pPr>
+      <w:spacing w:before="100" w:beforeAutospacing="1" w:after="100" w:afterAutospacing="1"/>
+    </w:pPr>
+    <w:rPr>
+      <w:rFonts w:ascii="Times New Roman" w:eastAsia="Times New Roman" w:hAnsi="Times New Roman" w:cs="Times New Roman"/>
+      <w:kern w:val="0"/>
+      <w14:ligatures w14:val="none"/>
+    </w:rPr>
+  </w:style>
+  <w:style w:type="character" w:customStyle="1" w:styleId="selectable-text1">
+    <w:name w:val="selectable-text1"/>
+    <w:basedOn w:val="DefaultParagraphFont"/>
+    <w:rsid w:val="00C8494C"/>
+  </w:style>
 </w:styles>
 </file>
 

</xml_diff>

<commit_message>
Edits from review session
</commit_message>
<xml_diff>
--- a/Proof Reading and Review/TCB Mvt for Vn and Orch - Errata_v2.docx
+++ b/Proof Reading and Review/TCB Mvt for Vn and Orch - Errata_v2.docx
@@ -635,7 +635,25 @@
                 <w:sz w:val="22"/>
                 <w:szCs w:val="22"/>
               </w:rPr>
-              <w:t>, while violin is in C</w:t>
+              <w:t xml:space="preserve">, while </w:t>
+            </w:r>
+            <w:r>
+              <w:rPr>
+                <w:rFonts w:ascii="Times New Roman" w:eastAsia="Times" w:hAnsi="Times New Roman" w:cs="Times New Roman"/>
+                <w:color w:val="000000" w:themeColor="text1"/>
+                <w:sz w:val="22"/>
+                <w:szCs w:val="22"/>
+              </w:rPr>
+              <w:t>solo v</w:t>
+            </w:r>
+            <w:r>
+              <w:rPr>
+                <w:rFonts w:ascii="Times New Roman" w:eastAsia="Times" w:hAnsi="Times New Roman" w:cs="Times New Roman"/>
+                <w:color w:val="000000" w:themeColor="text1"/>
+                <w:sz w:val="22"/>
+                <w:szCs w:val="22"/>
+              </w:rPr>
+              <w:t>iolin is in C</w:t>
             </w:r>
             <w:r>
               <w:rPr>
@@ -1389,6 +1407,26 @@
                 <w:szCs w:val="22"/>
               </w:rPr>
             </w:pPr>
+            <w:proofErr w:type="spellStart"/>
+            <w:r>
+              <w:rPr>
+                <w:rFonts w:ascii="Times New Roman" w:eastAsia="Times" w:hAnsi="Times New Roman" w:cs="Times New Roman"/>
+                <w:color w:val="00B050"/>
+                <w:sz w:val="22"/>
+                <w:szCs w:val="22"/>
+              </w:rPr>
+              <w:t>Vln</w:t>
+            </w:r>
+            <w:proofErr w:type="spellEnd"/>
+            <w:r>
+              <w:rPr>
+                <w:rFonts w:ascii="Times New Roman" w:eastAsia="Times" w:hAnsi="Times New Roman" w:cs="Times New Roman"/>
+                <w:color w:val="00B050"/>
+                <w:sz w:val="22"/>
+                <w:szCs w:val="22"/>
+              </w:rPr>
+              <w:t xml:space="preserve"> II</w:t>
+            </w:r>
           </w:p>
         </w:tc>
         <w:tc>
@@ -1412,6 +1450,15 @@
                 <w:szCs w:val="22"/>
               </w:rPr>
             </w:pPr>
+            <w:r>
+              <w:rPr>
+                <w:rFonts w:ascii="Times New Roman" w:eastAsia="Times" w:hAnsi="Times New Roman" w:cs="Times New Roman"/>
+                <w:color w:val="00B050"/>
+                <w:sz w:val="22"/>
+                <w:szCs w:val="22"/>
+              </w:rPr>
+              <w:t>188</w:t>
+            </w:r>
           </w:p>
         </w:tc>
         <w:tc>
@@ -1435,103 +1482,15 @@
                 <w:szCs w:val="22"/>
               </w:rPr>
             </w:pPr>
-          </w:p>
-        </w:tc>
-        <w:tc>
-          <w:tcPr>
-            <w:tcW w:w="1024" w:type="pct"/>
-            <w:tcBorders>
-              <w:top w:val="single" w:sz="4" w:space="0" w:color="000000"/>
-              <w:left w:val="single" w:sz="4" w:space="0" w:color="000000"/>
-              <w:bottom w:val="single" w:sz="4" w:space="0" w:color="000000"/>
-              <w:right w:val="single" w:sz="4" w:space="0" w:color="000000"/>
-            </w:tcBorders>
-            <w:vAlign w:val="center"/>
-          </w:tcPr>
-          <w:p>
-            <w:pPr>
-              <w:spacing w:line="276" w:lineRule="auto"/>
-              <w:rPr>
-                <w:rFonts w:ascii="Times New Roman" w:eastAsia="Times" w:hAnsi="Times New Roman" w:cs="Times New Roman"/>
-                <w:color w:val="00B050"/>
-                <w:sz w:val="22"/>
-                <w:szCs w:val="22"/>
-              </w:rPr>
-            </w:pPr>
-          </w:p>
-        </w:tc>
-      </w:tr>
-      <w:tr>
-        <w:trPr>
-          <w:trHeight w:val="350"/>
-        </w:trPr>
-        <w:tc>
-          <w:tcPr>
-            <w:tcW w:w="756" w:type="pct"/>
-            <w:tcBorders>
-              <w:top w:val="single" w:sz="4" w:space="0" w:color="000000"/>
-              <w:left w:val="single" w:sz="4" w:space="0" w:color="000000"/>
-              <w:bottom w:val="single" w:sz="4" w:space="0" w:color="000000"/>
-              <w:right w:val="single" w:sz="4" w:space="0" w:color="000000"/>
-            </w:tcBorders>
-            <w:vAlign w:val="center"/>
-          </w:tcPr>
-          <w:p>
-            <w:pPr>
-              <w:spacing w:line="276" w:lineRule="auto"/>
-              <w:rPr>
-                <w:rFonts w:ascii="Times New Roman" w:eastAsia="Times" w:hAnsi="Times New Roman" w:cs="Times New Roman"/>
-                <w:color w:val="00B050"/>
-                <w:sz w:val="22"/>
-                <w:szCs w:val="22"/>
-              </w:rPr>
-            </w:pPr>
-          </w:p>
-        </w:tc>
-        <w:tc>
-          <w:tcPr>
-            <w:tcW w:w="727" w:type="pct"/>
-            <w:tcBorders>
-              <w:top w:val="single" w:sz="4" w:space="0" w:color="000000"/>
-              <w:left w:val="single" w:sz="4" w:space="0" w:color="000000"/>
-              <w:bottom w:val="single" w:sz="4" w:space="0" w:color="000000"/>
-              <w:right w:val="single" w:sz="4" w:space="0" w:color="000000"/>
-            </w:tcBorders>
-            <w:vAlign w:val="center"/>
-          </w:tcPr>
-          <w:p>
-            <w:pPr>
-              <w:spacing w:line="276" w:lineRule="auto"/>
-              <w:rPr>
-                <w:rFonts w:ascii="Times New Roman" w:eastAsia="Times" w:hAnsi="Times New Roman" w:cs="Times New Roman"/>
-                <w:color w:val="00B050"/>
-                <w:sz w:val="22"/>
-                <w:szCs w:val="22"/>
-              </w:rPr>
-            </w:pPr>
-          </w:p>
-        </w:tc>
-        <w:tc>
-          <w:tcPr>
-            <w:tcW w:w="2493" w:type="pct"/>
-            <w:tcBorders>
-              <w:top w:val="single" w:sz="4" w:space="0" w:color="000000"/>
-              <w:left w:val="single" w:sz="4" w:space="0" w:color="000000"/>
-              <w:bottom w:val="single" w:sz="4" w:space="0" w:color="000000"/>
-              <w:right w:val="single" w:sz="4" w:space="0" w:color="000000"/>
-            </w:tcBorders>
-            <w:vAlign w:val="center"/>
-          </w:tcPr>
-          <w:p>
-            <w:pPr>
-              <w:spacing w:line="276" w:lineRule="auto"/>
-              <w:rPr>
-                <w:rFonts w:ascii="Times New Roman" w:eastAsia="Times" w:hAnsi="Times New Roman" w:cs="Times New Roman"/>
-                <w:color w:val="00B050"/>
-                <w:sz w:val="22"/>
-                <w:szCs w:val="22"/>
-              </w:rPr>
-            </w:pPr>
+            <w:r>
+              <w:rPr>
+                <w:rFonts w:ascii="Times New Roman" w:eastAsia="Times" w:hAnsi="Times New Roman" w:cs="Times New Roman"/>
+                <w:color w:val="00B050"/>
+                <w:sz w:val="22"/>
+                <w:szCs w:val="22"/>
+              </w:rPr>
+              <w:t xml:space="preserve">This bar has top voice tremolo but next bar it changes to bottom voice. </w:t>
+            </w:r>
           </w:p>
         </w:tc>
         <w:tc>

</xml_diff>